<commit_message>
Agregar concordancia con la Ley 1952 de 2019 al esquema de reglas
Co-Authored-By: Claude Sonnet 5.5 <noreply@anthropic.com>
Claude-Session: https://claude.ai/code/session_01HFz41Xq5pxE4jPsKEtG9Mg
</commit_message>
<xml_diff>
--- a/Esquema_Reglas_Valoracion_Probatoria_Disciplinaria.docx
+++ b/Esquema_Reglas_Valoracion_Probatoria_Disciplinaria.docx
@@ -1470,6 +1470,1126 @@
         <w:t>CE 0665-12, 2430-16, 2143-16, 0941-19, 1286-2021, 3358-2022, 2941-2021, 2700-2013 y TA Cundinamarca 2018-01948-00: niegan la nulidad (3358-2022 y 1286-2021 confirman en lo sustancial).</w:t>
       </w:r>
     </w:p>
+    <w:p>
+      <w:r>
+        <w:br w:type="page"/>
+      </w:r>
+    </w:p>
+    <w:p>
+      <w:pPr>
+        <w:pStyle w:val="Heading1"/>
+      </w:pPr>
+      <w:r>
+        <w:t>Concordancia con la Ley 1952 de 2019 (Código General Disciplinario)</w:t>
+      </w:r>
+    </w:p>
+    <w:p>
+      <w:r>
+        <w:t>Fuente de la Ley 1952: copia «LEY 1952 DE 2019 - LEY 2094 DE 2021.docx» de la carpeta de Drive del usuario (texto de la Secretaría del Senado con notas de vigencia). No pude contrastarla con el sitio oficial (acceso bloqueado en este entorno). La copia no registra cambios posteriores a 2021 (p. ej., no menciona la C-030 de 2023): verifica la vigencia en el texto oficial antes de aplicar. Según el encabezado de esa copia, la ley rige desde el 29-mar-2022; las sentencias del esquema aplican en su mayoría la Ley 734 de 2002 por la fecha de los hechos, y el art. 8 de la Ley 1952 consagra la favorabilidad.</w:t>
+      </w:r>
+    </w:p>
+    <w:p>
+      <w:r>
+        <w:rPr>
+          <w:b/>
+        </w:rPr>
+        <w:t xml:space="preserve">Advertencia sobre la Ley 734. </w:t>
+      </w:r>
+      <w:r>
+        <w:t>Las sentencias leídas no son consistentes en la numeración de la Ley 734: por ejemplo, el art. 141 aparece citado tanto para la apreciación con sana crítica como para la motivación, y el art. 130 tanto para el traslado de prueba como para los indicios. La columna «Ley 734» recoge lo que cada sentencia cita; solo en los arts. 140 (apreciación integral), 142 (prueba para sancionar) y 135 (prueba trasladada) el texto reproducido en la sentencia coincide con el de la Ley 1952. Verifica la numeración en el texto de la Ley 734.</w:t>
+      </w:r>
+    </w:p>
+    <w:tbl>
+      <w:tblPr>
+        <w:tblStyle w:val="LightGrid-Accent1"/>
+        <w:tblW w:type="auto" w:w="0"/>
+        <w:tblLook w:firstColumn="1" w:firstRow="1" w:lastColumn="0" w:lastRow="0" w:noHBand="0" w:noVBand="1" w:val="04A0"/>
+      </w:tblPr>
+      <w:tblGrid>
+        <w:gridCol w:w="1881"/>
+        <w:gridCol w:w="1881"/>
+        <w:gridCol w:w="1881"/>
+        <w:gridCol w:w="1881"/>
+        <w:gridCol w:w="1881"/>
+      </w:tblGrid>
+      <w:tr>
+        <w:tc>
+          <w:tcPr>
+            <w:tcW w:type="dxa" w:w="1881"/>
+          </w:tcPr>
+          <w:p>
+            <w:r>
+              <w:rPr>
+                <w:sz w:val="17"/>
+              </w:rPr>
+              <w:t>Tema</w:t>
+            </w:r>
+          </w:p>
+        </w:tc>
+        <w:tc>
+          <w:tcPr>
+            <w:tcW w:type="dxa" w:w="1881"/>
+          </w:tcPr>
+          <w:p>
+            <w:r>
+              <w:rPr>
+                <w:sz w:val="17"/>
+              </w:rPr>
+              <w:t>Ley 734 (según sentencias)</w:t>
+            </w:r>
+          </w:p>
+        </w:tc>
+        <w:tc>
+          <w:tcPr>
+            <w:tcW w:type="dxa" w:w="1881"/>
+          </w:tcPr>
+          <w:p>
+            <w:r>
+              <w:rPr>
+                <w:sz w:val="17"/>
+              </w:rPr>
+              <w:t>Ley 1952 (art.)</w:t>
+            </w:r>
+          </w:p>
+        </w:tc>
+        <w:tc>
+          <w:tcPr>
+            <w:tcW w:type="dxa" w:w="1881"/>
+          </w:tcPr>
+          <w:p>
+            <w:r>
+              <w:rPr>
+                <w:sz w:val="17"/>
+              </w:rPr>
+              <w:t>Texto de la Ley 1952 (copia de Drive)</w:t>
+            </w:r>
+          </w:p>
+        </w:tc>
+        <w:tc>
+          <w:tcPr>
+            <w:tcW w:type="dxa" w:w="1881"/>
+          </w:tcPr>
+          <w:p>
+            <w:r>
+              <w:rPr>
+                <w:sz w:val="17"/>
+              </w:rPr>
+              <w:t>Observación</w:t>
+            </w:r>
+          </w:p>
+        </w:tc>
+      </w:tr>
+      <w:tr>
+        <w:tc>
+          <w:tcPr>
+            <w:tcW w:type="dxa" w:w="1881"/>
+          </w:tcPr>
+          <w:p>
+            <w:r>
+              <w:rPr>
+                <w:sz w:val="17"/>
+              </w:rPr>
+              <w:t>Carga de la prueba</w:t>
+            </w:r>
+          </w:p>
+        </w:tc>
+        <w:tc>
+          <w:tcPr>
+            <w:tcW w:type="dxa" w:w="1881"/>
+          </w:tcPr>
+          <w:p>
+            <w:r>
+              <w:rPr>
+                <w:sz w:val="17"/>
+              </w:rPr>
+              <w:t>128 (carga del Estado)</w:t>
+            </w:r>
+          </w:p>
+        </w:tc>
+        <w:tc>
+          <w:tcPr>
+            <w:tcW w:type="dxa" w:w="1881"/>
+          </w:tcPr>
+          <w:p>
+            <w:r>
+              <w:rPr>
+                <w:sz w:val="17"/>
+              </w:rPr>
+              <w:t>147</w:t>
+            </w:r>
+          </w:p>
+        </w:tc>
+        <w:tc>
+          <w:tcPr>
+            <w:tcW w:type="dxa" w:w="1881"/>
+          </w:tcPr>
+          <w:p>
+            <w:r>
+              <w:rPr>
+                <w:sz w:val="17"/>
+              </w:rPr>
+              <w:t>ARTÍCULO 147. NECESIDAD Y CARGA DE LA PRUEBA. Toda decisión interlocutoria y el fallo disciplinario deben fundarse en pruebas legalmente producidas y aportadas al proceso por petición de cualquier sujeto procesal o en forma oficiosa. La carga de la prueba corresponde al Estado.</w:t>
+            </w:r>
+          </w:p>
+        </w:tc>
+        <w:tc>
+          <w:tcPr>
+            <w:tcW w:type="dxa" w:w="1881"/>
+          </w:tcPr>
+          <w:p>
+            <w:r>
+              <w:rPr>
+                <w:sz w:val="17"/>
+              </w:rPr>
+              <w:t>Mismo contenido.</w:t>
+            </w:r>
+          </w:p>
+        </w:tc>
+      </w:tr>
+      <w:tr>
+        <w:tc>
+          <w:tcPr>
+            <w:tcW w:type="dxa" w:w="1881"/>
+          </w:tcPr>
+          <w:p>
+            <w:r>
+              <w:rPr>
+                <w:sz w:val="17"/>
+              </w:rPr>
+              <w:t>Búsqueda de la verdad; investigación integral</w:t>
+            </w:r>
+          </w:p>
+        </w:tc>
+        <w:tc>
+          <w:tcPr>
+            <w:tcW w:type="dxa" w:w="1881"/>
+          </w:tcPr>
+          <w:p>
+            <w:r>
+              <w:rPr>
+                <w:sz w:val="17"/>
+              </w:rPr>
+              <w:t>129; principio de investigación integral</w:t>
+            </w:r>
+          </w:p>
+        </w:tc>
+        <w:tc>
+          <w:tcPr>
+            <w:tcW w:type="dxa" w:w="1881"/>
+          </w:tcPr>
+          <w:p>
+            <w:r>
+              <w:rPr>
+                <w:sz w:val="17"/>
+              </w:rPr>
+              <w:t>13 y 148</w:t>
+            </w:r>
+          </w:p>
+        </w:tc>
+        <w:tc>
+          <w:tcPr>
+            <w:tcW w:type="dxa" w:w="1881"/>
+          </w:tcPr>
+          <w:p>
+            <w:r>
+              <w:rPr>
+                <w:sz w:val="17"/>
+              </w:rPr>
+              <w:t>ARTÍCULO 13. INVESTIGACIÓN INTEGRAL. Las autoridades disciplinarias tienen la obligación de investigar con igual rigor los hechos y circunstancias que demuestren la existencia de falta disciplinaria y la responsabilidad del investigado y los que tiendan a demo | ARTÍCULO 148. IMPARCIALIDAD DEL FUNCIONARIO EN LA BÚSQUEDA DE LA PRUEBA. El funcionario buscará la verdad real. Para ello deberá investigar con igual rigor los hechos y circunstancias que demuestren la existencia de la falta disciplinaria y la responsabilidad del investigado, y los que tiendan a demostrar su inexistenc</w:t>
+            </w:r>
+          </w:p>
+        </w:tc>
+        <w:tc>
+          <w:tcPr>
+            <w:tcW w:type="dxa" w:w="1881"/>
+          </w:tcPr>
+          <w:p>
+            <w:r>
+              <w:rPr>
+                <w:sz w:val="17"/>
+              </w:rPr>
+              <w:t>La Ley 1952 eleva la investigación integral a principio rector (art. 13), que la CNDJ aplicó en el Rad. 2021-00235-02.</w:t>
+            </w:r>
+          </w:p>
+        </w:tc>
+      </w:tr>
+      <w:tr>
+        <w:tc>
+          <w:tcPr>
+            <w:tcW w:type="dxa" w:w="1881"/>
+          </w:tcPr>
+          <w:p>
+            <w:r>
+              <w:rPr>
+                <w:sz w:val="17"/>
+              </w:rPr>
+              <w:t>Presunción de inocencia y duda</w:t>
+            </w:r>
+          </w:p>
+        </w:tc>
+        <w:tc>
+          <w:tcPr>
+            <w:tcW w:type="dxa" w:w="1881"/>
+          </w:tcPr>
+          <w:p>
+            <w:r>
+              <w:rPr>
+                <w:sz w:val="17"/>
+              </w:rPr>
+              <w:t>9</w:t>
+            </w:r>
+          </w:p>
+        </w:tc>
+        <w:tc>
+          <w:tcPr>
+            <w:tcW w:type="dxa" w:w="1881"/>
+          </w:tcPr>
+          <w:p>
+            <w:r>
+              <w:rPr>
+                <w:sz w:val="17"/>
+              </w:rPr>
+              <w:t>14</w:t>
+            </w:r>
+          </w:p>
+        </w:tc>
+        <w:tc>
+          <w:tcPr>
+            <w:tcW w:type="dxa" w:w="1881"/>
+          </w:tcPr>
+          <w:p>
+            <w:r>
+              <w:rPr>
+                <w:sz w:val="17"/>
+              </w:rPr>
+              <w:t>ARTÍCULO 14. PRESUNCIÓN DE INOCENCIA. El sujeto disciplinable se presume inocente y debe ser tratado como tal mientras no se declare su responsabilidad en fallo ejecutoriado. Durante la actuación disciplinaria toda duda razonable se resolverá a favor del sujeto disciplinable cuando no haya modo de eliminar la responsabilidad.</w:t>
+            </w:r>
+          </w:p>
+        </w:tc>
+        <w:tc>
+          <w:tcPr>
+            <w:tcW w:type="dxa" w:w="1881"/>
+          </w:tcPr>
+          <w:p>
+            <w:r>
+              <w:rPr>
+                <w:sz w:val="17"/>
+              </w:rPr>
+              <w:t>La C-495 de 2019 declaró inexequible la frase «cuando no haya modo de eliminar la responsabilidad»; la duda razonable se resuelve a favor del sujeto disciplinable.</w:t>
+            </w:r>
+          </w:p>
+        </w:tc>
+      </w:tr>
+      <w:tr>
+        <w:tc>
+          <w:tcPr>
+            <w:tcW w:type="dxa" w:w="1881"/>
+          </w:tcPr>
+          <w:p>
+            <w:r>
+              <w:rPr>
+                <w:sz w:val="17"/>
+              </w:rPr>
+              <w:t>Apreciación integral y sana crítica</w:t>
+            </w:r>
+          </w:p>
+        </w:tc>
+        <w:tc>
+          <w:tcPr>
+            <w:tcW w:type="dxa" w:w="1881"/>
+          </w:tcPr>
+          <w:p>
+            <w:r>
+              <w:rPr>
+                <w:sz w:val="17"/>
+              </w:rPr>
+              <w:t>140 (texto verificado en CE 1667-2022)</w:t>
+            </w:r>
+          </w:p>
+        </w:tc>
+        <w:tc>
+          <w:tcPr>
+            <w:tcW w:type="dxa" w:w="1881"/>
+          </w:tcPr>
+          <w:p>
+            <w:r>
+              <w:rPr>
+                <w:sz w:val="17"/>
+              </w:rPr>
+              <w:t>159 y 19</w:t>
+            </w:r>
+          </w:p>
+        </w:tc>
+        <w:tc>
+          <w:tcPr>
+            <w:tcW w:type="dxa" w:w="1881"/>
+          </w:tcPr>
+          <w:p>
+            <w:r>
+              <w:rPr>
+                <w:sz w:val="17"/>
+              </w:rPr>
+              <w:t>ARTÍCULO 159. APRECIACIÓN INTEGRAL DE LAS PRUEBAS. Las pruebas deberán apreciarse conjuntamente, de acuerdo con las reglas de la sana crítica. En toda decisión motivada deberá exponerse razonadamente el mérito de las pruebas en que esta se fundamenta.</w:t>
+            </w:r>
+          </w:p>
+        </w:tc>
+        <w:tc>
+          <w:tcPr>
+            <w:tcW w:type="dxa" w:w="1881"/>
+          </w:tcPr>
+          <w:p>
+            <w:r>
+              <w:rPr>
+                <w:sz w:val="17"/>
+              </w:rPr>
+              <w:t>Texto equivalente; el art. 19 añade que toda decisión de fondo debe motivarse.</w:t>
+            </w:r>
+          </w:p>
+        </w:tc>
+      </w:tr>
+      <w:tr>
+        <w:tc>
+          <w:tcPr>
+            <w:tcW w:type="dxa" w:w="1881"/>
+          </w:tcPr>
+          <w:p>
+            <w:r>
+              <w:rPr>
+                <w:sz w:val="17"/>
+              </w:rPr>
+              <w:t>Prueba para sancionar</w:t>
+            </w:r>
+          </w:p>
+        </w:tc>
+        <w:tc>
+          <w:tcPr>
+            <w:tcW w:type="dxa" w:w="1881"/>
+          </w:tcPr>
+          <w:p>
+            <w:r>
+              <w:rPr>
+                <w:sz w:val="17"/>
+              </w:rPr>
+              <w:t>142 (texto verificado en CE 1667-2022)</w:t>
+            </w:r>
+          </w:p>
+        </w:tc>
+        <w:tc>
+          <w:tcPr>
+            <w:tcW w:type="dxa" w:w="1881"/>
+          </w:tcPr>
+          <w:p>
+            <w:r>
+              <w:rPr>
+                <w:sz w:val="17"/>
+              </w:rPr>
+              <w:t>160</w:t>
+            </w:r>
+          </w:p>
+        </w:tc>
+        <w:tc>
+          <w:tcPr>
+            <w:tcW w:type="dxa" w:w="1881"/>
+          </w:tcPr>
+          <w:p>
+            <w:r>
+              <w:rPr>
+                <w:sz w:val="17"/>
+              </w:rPr>
+              <w:t>ARTÍCULO 160. PRUEBA PARA SANCIONAR. No se podrá proferir fallo sancionatorio sin que obre en el proceso prueba que conduzca a la certeza sobre la existencia de la falta y de la responsabilidad del disciplinado. CAPÍTULO I. CONFESIÓN.</w:t>
+            </w:r>
+          </w:p>
+        </w:tc>
+        <w:tc>
+          <w:tcPr>
+            <w:tcW w:type="dxa" w:w="1881"/>
+          </w:tcPr>
+          <w:p>
+            <w:r>
+              <w:rPr>
+                <w:sz w:val="17"/>
+              </w:rPr>
+              <w:t>Cambia «investigado» por «disciplinado».</w:t>
+            </w:r>
+          </w:p>
+        </w:tc>
+      </w:tr>
+      <w:tr>
+        <w:tc>
+          <w:tcPr>
+            <w:tcW w:type="dxa" w:w="1881"/>
+          </w:tcPr>
+          <w:p>
+            <w:r>
+              <w:rPr>
+                <w:sz w:val="17"/>
+              </w:rPr>
+              <w:t>Libertad de prueba; medios; indicios</w:t>
+            </w:r>
+          </w:p>
+        </w:tc>
+        <w:tc>
+          <w:tcPr>
+            <w:tcW w:type="dxa" w:w="1881"/>
+          </w:tcPr>
+          <w:p>
+            <w:r>
+              <w:rPr>
+                <w:sz w:val="17"/>
+              </w:rPr>
+              <w:t>130 y 131</w:t>
+            </w:r>
+          </w:p>
+        </w:tc>
+        <w:tc>
+          <w:tcPr>
+            <w:tcW w:type="dxa" w:w="1881"/>
+          </w:tcPr>
+          <w:p>
+            <w:r>
+              <w:rPr>
+                <w:sz w:val="17"/>
+              </w:rPr>
+              <w:t>149 y 150</w:t>
+            </w:r>
+          </w:p>
+        </w:tc>
+        <w:tc>
+          <w:tcPr>
+            <w:tcW w:type="dxa" w:w="1881"/>
+          </w:tcPr>
+          <w:p>
+            <w:r>
+              <w:rPr>
+                <w:sz w:val="17"/>
+              </w:rPr>
+              <w:t>ARTÍCULO 149. MEDIOS DE PRUEBA. Son medios de prueba la confesión, el testimonio, la peritación, la inspección disciplinaria y los documentos, los cuales se practicarán de acuerdo con las reglas previstas en este código. Los indicios se tendrán en cuenta en el momento de apreciar las pruebas, siguiendo los principios de la sana crítica. Los medios de prueba no previstos en esta ley se practicarán de acuerdo con las disposiciones que los regulen, respetando siempre l</w:t>
+            </w:r>
+          </w:p>
+        </w:tc>
+        <w:tc>
+          <w:tcPr>
+            <w:tcW w:type="dxa" w:w="1881"/>
+          </w:tcPr>
+          <w:p>
+            <w:r>
+              <w:rPr>
+                <w:sz w:val="17"/>
+              </w:rPr>
+              <w:t>El art. 149 conserva que los indicios se aprecian con sana crítica.</w:t>
+            </w:r>
+          </w:p>
+        </w:tc>
+      </w:tr>
+      <w:tr>
+        <w:tc>
+          <w:tcPr>
+            <w:tcW w:type="dxa" w:w="1881"/>
+          </w:tcPr>
+          <w:p>
+            <w:r>
+              <w:rPr>
+                <w:sz w:val="17"/>
+              </w:rPr>
+              <w:t>Indicios</w:t>
+            </w:r>
+          </w:p>
+        </w:tc>
+        <w:tc>
+          <w:tcPr>
+            <w:tcW w:type="dxa" w:w="1881"/>
+          </w:tcPr>
+          <w:p>
+            <w:r>
+              <w:rPr>
+                <w:sz w:val="17"/>
+              </w:rPr>
+              <w:t>130</w:t>
+            </w:r>
+          </w:p>
+        </w:tc>
+        <w:tc>
+          <w:tcPr>
+            <w:tcW w:type="dxa" w:w="1881"/>
+          </w:tcPr>
+          <w:p>
+            <w:r>
+              <w:rPr>
+                <w:sz w:val="17"/>
+              </w:rPr>
+              <w:t>196 a 199</w:t>
+            </w:r>
+          </w:p>
+        </w:tc>
+        <w:tc>
+          <w:tcPr>
+            <w:tcW w:type="dxa" w:w="1881"/>
+          </w:tcPr>
+          <w:p>
+            <w:r>
+              <w:rPr>
+                <w:sz w:val="17"/>
+              </w:rPr>
+              <w:t>ARTÍCULO 196. ELEMENTOS. Todo indicio ha de basarse en la experiencia y supone un hecho indicador, del cual el funcionario infiere lógicamente la existencia de otro hecho. | ARTÍCULO 198. PRUEBA DEL HECHO INDICADOR. El hecho indicador debe estar probado. | ARTÍCULO 199. APRECIACIÓN. El funcionario apreciará los indicios en conjunto teniendo en cuenta su gravedad, concordancia y convergencia, y su relación con los medios de prueba que obren en la actuación procesal. TÍTULO VII. ATRIBUCIONES DE POLICÍA JUDICIAL.</w:t>
+            </w:r>
+          </w:p>
+        </w:tc>
+        <w:tc>
+          <w:tcPr>
+            <w:tcW w:type="dxa" w:w="1881"/>
+          </w:tcPr>
+          <w:p>
+            <w:r>
+              <w:rPr>
+                <w:sz w:val="17"/>
+              </w:rPr>
+              <w:t>La Ley 1952 regula elementos, unidad, prueba del hecho indicador y apreciación en conjunto. Compárese con CE 4344-2018 y CNDJ 2019-02691.</w:t>
+            </w:r>
+          </w:p>
+        </w:tc>
+      </w:tr>
+      <w:tr>
+        <w:tc>
+          <w:tcPr>
+            <w:tcW w:type="dxa" w:w="1881"/>
+          </w:tcPr>
+          <w:p>
+            <w:r>
+              <w:rPr>
+                <w:sz w:val="17"/>
+              </w:rPr>
+              <w:t>Petición y negación de pruebas</w:t>
+            </w:r>
+          </w:p>
+        </w:tc>
+        <w:tc>
+          <w:tcPr>
+            <w:tcW w:type="dxa" w:w="1881"/>
+          </w:tcPr>
+          <w:p>
+            <w:r>
+              <w:rPr>
+                <w:sz w:val="17"/>
+              </w:rPr>
+              <w:t>132</w:t>
+            </w:r>
+          </w:p>
+        </w:tc>
+        <w:tc>
+          <w:tcPr>
+            <w:tcW w:type="dxa" w:w="1881"/>
+          </w:tcPr>
+          <w:p>
+            <w:r>
+              <w:rPr>
+                <w:sz w:val="17"/>
+              </w:rPr>
+              <w:t>151</w:t>
+            </w:r>
+          </w:p>
+        </w:tc>
+        <w:tc>
+          <w:tcPr>
+            <w:tcW w:type="dxa" w:w="1881"/>
+          </w:tcPr>
+          <w:p>
+            <w:r>
+              <w:rPr>
+                <w:sz w:val="17"/>
+              </w:rPr>
+              <w:t>ARTÍCULO 151. PETICIÓN Y NEGACIÓN DE PRUEBAS. Los sujetos procesales pueden aportar y solicitar la práctica de las pruebas que estimen conducentes y pertinentes. Serán negadas las inconducentes, las impertinentes y las superfluas y no se atenderán las practicadas ilegalmente.</w:t>
+            </w:r>
+          </w:p>
+        </w:tc>
+        <w:tc>
+          <w:tcPr>
+            <w:tcW w:type="dxa" w:w="1881"/>
+          </w:tcPr>
+          <w:p>
+            <w:r>
+              <w:rPr>
+                <w:sz w:val="17"/>
+              </w:rPr>
+              <w:t>Mismo contenido: se niegan inconducentes, impertinentes y superfluas.</w:t>
+            </w:r>
+          </w:p>
+        </w:tc>
+      </w:tr>
+      <w:tr>
+        <w:tc>
+          <w:tcPr>
+            <w:tcW w:type="dxa" w:w="1881"/>
+          </w:tcPr>
+          <w:p>
+            <w:r>
+              <w:rPr>
+                <w:sz w:val="17"/>
+              </w:rPr>
+              <w:t>Prueba ilícita; cláusula de exclusión</w:t>
+            </w:r>
+          </w:p>
+        </w:tc>
+        <w:tc>
+          <w:tcPr>
+            <w:tcW w:type="dxa" w:w="1881"/>
+          </w:tcPr>
+          <w:p>
+            <w:r>
+              <w:rPr>
+                <w:sz w:val="17"/>
+              </w:rPr>
+              <w:t>art. 29 C.P.; art. 21 (integración con el CPP)</w:t>
+            </w:r>
+          </w:p>
+        </w:tc>
+        <w:tc>
+          <w:tcPr>
+            <w:tcW w:type="dxa" w:w="1881"/>
+          </w:tcPr>
+          <w:p>
+            <w:r>
+              <w:rPr>
+                <w:sz w:val="17"/>
+              </w:rPr>
+              <w:t>21, 151 y 158</w:t>
+            </w:r>
+          </w:p>
+        </w:tc>
+        <w:tc>
+          <w:tcPr>
+            <w:tcW w:type="dxa" w:w="1881"/>
+          </w:tcPr>
+          <w:p>
+            <w:r>
+              <w:rPr>
+                <w:sz w:val="17"/>
+              </w:rPr>
+              <w:t>ARTÍCULO 21. CLÁUSULA DE EXCLUSIÓN. Toda prueba obtenida con violación de los derechos y garantías fundamentales será nula de pleno derecho, por lo quedeberá excluirse de la actuación procesal. Igual tratamiento recibirán las pruebas que sean consecuencia de las pruebas excluidas o las que solo puedan explicarse en razón de su existencia. Se deben considerar, al respecto, las siguientes excepciones: la fuente independiente, el vínculo atenuado, el descubrimiento inevitable y los demás que establezca la ley. | ARTÍCULO 158. INEXISTENCIA DE LA PRUEBA. La prueba recaudada sin el lleno de las formalidades sustanciales o con desconocimiento de los derechos fundamentales del investigado se tendrá como inexistente.</w:t>
+            </w:r>
+          </w:p>
+        </w:tc>
+        <w:tc>
+          <w:tcPr>
+            <w:tcW w:type="dxa" w:w="1881"/>
+          </w:tcPr>
+          <w:p>
+            <w:r>
+              <w:rPr>
+                <w:sz w:val="17"/>
+              </w:rPr>
+              <w:t>La Ley 1952 consagra expresamente la exclusión de la prueba derivada y las excepciones (fuente independiente, vínculo atenuado, descubrimiento inevitable), que CE 2201-11 aplicó por integración con el CPP.</w:t>
+            </w:r>
+          </w:p>
+        </w:tc>
+      </w:tr>
+      <w:tr>
+        <w:tc>
+          <w:tcPr>
+            <w:tcW w:type="dxa" w:w="1881"/>
+          </w:tcPr>
+          <w:p>
+            <w:r>
+              <w:rPr>
+                <w:sz w:val="17"/>
+              </w:rPr>
+              <w:t>Prueba trasladada</w:t>
+            </w:r>
+          </w:p>
+        </w:tc>
+        <w:tc>
+          <w:tcPr>
+            <w:tcW w:type="dxa" w:w="1881"/>
+          </w:tcPr>
+          <w:p>
+            <w:r>
+              <w:rPr>
+                <w:sz w:val="17"/>
+              </w:rPr>
+              <w:t>135 (texto con la reforma de la Ley 1474 de 2011, según CE 0086-2014)</w:t>
+            </w:r>
+          </w:p>
+        </w:tc>
+        <w:tc>
+          <w:tcPr>
+            <w:tcW w:type="dxa" w:w="1881"/>
+          </w:tcPr>
+          <w:p>
+            <w:r>
+              <w:rPr>
+                <w:sz w:val="17"/>
+              </w:rPr>
+              <w:t>154</w:t>
+            </w:r>
+          </w:p>
+        </w:tc>
+        <w:tc>
+          <w:tcPr>
+            <w:tcW w:type="dxa" w:w="1881"/>
+          </w:tcPr>
+          <w:p>
+            <w:r>
+              <w:rPr>
+                <w:sz w:val="17"/>
+              </w:rPr>
+              <w:t>ARTÍCULO 154. JUZGAMIENTO DEL AUSENTE. Si el disciplinado no presentare escrito de descargos se dejará constancia en este sentido y de inmediato se le designará un apoderado para que lo represente en el trámite procesal.'El Artículo mencionado fue declarado EXEQUIBLE por la Corte Constitucional mediante sentencia [C-627-96 ](http://www.secretariasenado.gov.co/senado/basedoc/c-627_1996.html#B03E2)del 21 de noviembre de 1996. Magistrado Ponente, Dr. Antonio Barrera Carbonell. |</w:t>
+            </w:r>
+          </w:p>
+        </w:tc>
+        <w:tc>
+          <w:tcPr>
+            <w:tcW w:type="dxa" w:w="1881"/>
+          </w:tcPr>
+          <w:p>
+            <w:r>
+              <w:rPr>
+                <w:sz w:val="17"/>
+              </w:rPr>
+              <w:t>Incorpora la regla sobre elementos materiales descubiertos con el escrito de acusación, que deben someterse a contradicción (relevante para CE 0086-2014).</w:t>
+            </w:r>
+          </w:p>
+        </w:tc>
+      </w:tr>
+      <w:tr>
+        <w:tc>
+          <w:tcPr>
+            <w:tcW w:type="dxa" w:w="1881"/>
+          </w:tcPr>
+          <w:p>
+            <w:r>
+              <w:rPr>
+                <w:sz w:val="17"/>
+              </w:rPr>
+              <w:t>Contradicción de la prueba</w:t>
+            </w:r>
+          </w:p>
+        </w:tc>
+        <w:tc>
+          <w:tcPr>
+            <w:tcW w:type="dxa" w:w="1881"/>
+          </w:tcPr>
+          <w:p>
+            <w:r>
+              <w:rPr>
+                <w:sz w:val="17"/>
+              </w:rPr>
+              <w:t>137 (numeración no verificada)</w:t>
+            </w:r>
+          </w:p>
+        </w:tc>
+        <w:tc>
+          <w:tcPr>
+            <w:tcW w:type="dxa" w:w="1881"/>
+          </w:tcPr>
+          <w:p>
+            <w:r>
+              <w:rPr>
+                <w:sz w:val="17"/>
+              </w:rPr>
+              <w:t>157</w:t>
+            </w:r>
+          </w:p>
+        </w:tc>
+        <w:tc>
+          <w:tcPr>
+            <w:tcW w:type="dxa" w:w="1881"/>
+          </w:tcPr>
+          <w:p>
+            <w:r>
+              <w:rPr>
+                <w:sz w:val="17"/>
+              </w:rPr>
+              <w:t>ARTÍCULO 157. OPORTUNIDAD PARA CONTROVERTIR LA PRUEBA. Los sujetos procesales podrán controvertir las pruebas a partir del momento en que sean notificados del auto de apertura de investigación disciplinaria o de la orden de vinculación.</w:t>
+            </w:r>
+          </w:p>
+        </w:tc>
+        <w:tc>
+          <w:tcPr>
+            <w:tcW w:type="dxa" w:w="1881"/>
+          </w:tcPr>
+          <w:p>
+            <w:r>
+              <w:rPr>
+                <w:sz w:val="17"/>
+              </w:rPr>
+              <w:t>Contradicción desde la notificación del auto de apertura de investigación.</w:t>
+            </w:r>
+          </w:p>
+        </w:tc>
+      </w:tr>
+      <w:tr>
+        <w:tc>
+          <w:tcPr>
+            <w:tcW w:type="dxa" w:w="1881"/>
+          </w:tcPr>
+          <w:p>
+            <w:r>
+              <w:rPr>
+                <w:sz w:val="17"/>
+              </w:rPr>
+              <w:t>Testimonio; excepción al deber de declarar</w:t>
+            </w:r>
+          </w:p>
+        </w:tc>
+        <w:tc>
+          <w:tcPr>
+            <w:tcW w:type="dxa" w:w="1881"/>
+          </w:tcPr>
+          <w:p>
+            <w:r>
+              <w:rPr>
+                <w:sz w:val="17"/>
+              </w:rPr>
+              <w:t>art. 267 Ley 600 y art. 33 C.P., según CE 3358-2022</w:t>
+            </w:r>
+          </w:p>
+        </w:tc>
+        <w:tc>
+          <w:tcPr>
+            <w:tcW w:type="dxa" w:w="1881"/>
+          </w:tcPr>
+          <w:p>
+            <w:r>
+              <w:rPr>
+                <w:sz w:val="17"/>
+              </w:rPr>
+              <w:t>164 y 166</w:t>
+            </w:r>
+          </w:p>
+        </w:tc>
+        <w:tc>
+          <w:tcPr>
+            <w:tcW w:type="dxa" w:w="1881"/>
+          </w:tcPr>
+          <w:p>
+            <w:r>
+              <w:rPr>
+                <w:sz w:val="17"/>
+              </w:rPr>
+              <w:t>ARTÍCULO 166. EXCEPCIÓN AL DEBER DE DECLARAR. El servidor público informará a quien vaya a rendir testimonio sobre las garantías consagradas por el artículo [33 ](http://www.secretariasenado.gov.co/senado/basedoc/constitucion_politica_1991_pr001.html#B05DB)de la Constitución Naci</w:t>
+            </w:r>
+          </w:p>
+        </w:tc>
+        <w:tc>
+          <w:tcPr>
+            <w:tcW w:type="dxa" w:w="1881"/>
+          </w:tcPr>
+          <w:p>
+            <w:r>
+              <w:rPr>
+                <w:sz w:val="17"/>
+              </w:rPr>
+              <w:t>La Ley 1952 remite al art. 33 de la Constitución para el deber de informar la excepción al deber de declarar.</w:t>
+            </w:r>
+          </w:p>
+        </w:tc>
+      </w:tr>
+      <w:tr>
+        <w:tc>
+          <w:tcPr>
+            <w:tcW w:type="dxa" w:w="1881"/>
+          </w:tcPr>
+          <w:p>
+            <w:r>
+              <w:rPr>
+                <w:sz w:val="17"/>
+              </w:rPr>
+              <w:t>Testimonio de menores</w:t>
+            </w:r>
+          </w:p>
+        </w:tc>
+        <w:tc>
+          <w:tcPr>
+            <w:tcW w:type="dxa" w:w="1881"/>
+          </w:tcPr>
+          <w:p>
+            <w:r>
+              <w:rPr>
+                <w:sz w:val="17"/>
+              </w:rPr>
+              <w:t>—</w:t>
+            </w:r>
+          </w:p>
+        </w:tc>
+        <w:tc>
+          <w:tcPr>
+            <w:tcW w:type="dxa" w:w="1881"/>
+          </w:tcPr>
+          <w:p>
+            <w:r>
+              <w:rPr>
+                <w:sz w:val="17"/>
+              </w:rPr>
+              <w:t>164</w:t>
+            </w:r>
+          </w:p>
+        </w:tc>
+        <w:tc>
+          <w:tcPr>
+            <w:tcW w:type="dxa" w:w="1881"/>
+          </w:tcPr>
+          <w:p>
+            <w:r>
+              <w:rPr>
+                <w:sz w:val="17"/>
+              </w:rPr>
+              <w:t>ARTÍCULO 164. DEBER DE RENDIR TESTIMONIO. Toda persona está en la obligación de rendir bajo juramento el testimonio que se le solicita en la actuación procesal, salvo las excepciones constitucionales y legales. Los menores de edad que tengan más de siete años podrán rendir testimonio, diligencia que solo podrá ser recibida ante el Defensor o Comisario de Familia, en su despacho o a través de audio y video cuando las circunstancias así lo determinen. El menor absolverá el cuestionario enviado para el caso por la autoridad disciplinaria. El disciplinado o su defensor podrán formular preguntas que no sean contrarias</w:t>
+            </w:r>
+          </w:p>
+        </w:tc>
+        <w:tc>
+          <w:tcPr>
+            <w:tcW w:type="dxa" w:w="1881"/>
+          </w:tcPr>
+          <w:p>
+            <w:r>
+              <w:rPr>
+                <w:sz w:val="17"/>
+              </w:rPr>
+              <w:t>La C-452 de 2020 declaró inexequible «que tengan más de siete años». El art. 164 prevé preguntas del disciplinado o su defensor «que no sean contrarias al interés del declarante»; compárese con CE 2700-2013 (no contrainterrogar a menores víctimas).</w:t>
+            </w:r>
+          </w:p>
+        </w:tc>
+      </w:tr>
+      <w:tr>
+        <w:tc>
+          <w:tcPr>
+            <w:tcW w:type="dxa" w:w="1881"/>
+          </w:tcPr>
+          <w:p>
+            <w:r>
+              <w:rPr>
+                <w:sz w:val="17"/>
+              </w:rPr>
+              <w:t>Criterios para apreciar el testimonio</w:t>
+            </w:r>
+          </w:p>
+        </w:tc>
+        <w:tc>
+          <w:tcPr>
+            <w:tcW w:type="dxa" w:w="1881"/>
+          </w:tcPr>
+          <w:p>
+            <w:r>
+              <w:rPr>
+                <w:sz w:val="17"/>
+              </w:rPr>
+              <w:t>sana crítica</w:t>
+            </w:r>
+          </w:p>
+        </w:tc>
+        <w:tc>
+          <w:tcPr>
+            <w:tcW w:type="dxa" w:w="1881"/>
+          </w:tcPr>
+          <w:p>
+            <w:r>
+              <w:rPr>
+                <w:sz w:val="17"/>
+              </w:rPr>
+              <w:t>176</w:t>
+            </w:r>
+          </w:p>
+        </w:tc>
+        <w:tc>
+          <w:tcPr>
+            <w:tcW w:type="dxa" w:w="1881"/>
+          </w:tcPr>
+          <w:p>
+            <w:r>
+              <w:rPr>
+                <w:sz w:val="17"/>
+              </w:rPr>
+              <w:t>ARTÍCULO 176. CRITERIOS PARA LA APRECIACIÓN DEL TESTIMONIO. Para apreciar el testimonio, el funcionario tendrá en cuenta los principios de la sana crítica y especialmente lo relativo a la naturaleza del objeto percibido, al estado de sanidad del sentido o sentidos por los cuales se tuvo la percepción, las circunstancias de lugar, tiempo y modo en que se percibió, a la personalidad del declarante, a la forma como hubiere declarado y las singularidades que puedan observarse en el testimonio. CAPÍTULO III. PERITACIÓN.</w:t>
+            </w:r>
+          </w:p>
+        </w:tc>
+        <w:tc>
+          <w:tcPr>
+            <w:tcW w:type="dxa" w:w="1881"/>
+          </w:tcPr>
+          <w:p>
+            <w:r>
+              <w:rPr>
+                <w:sz w:val="17"/>
+              </w:rPr>
+              <w:t>Los criterios de coherencia, espontaneidad y corroboración que usa CE 2700-2013 no figuran en el art. 176; este enumera otros (objeto percibido, sentidos, circunstancias, personalidad, forma de declarar).</w:t>
+            </w:r>
+          </w:p>
+        </w:tc>
+      </w:tr>
+      <w:tr>
+        <w:tc>
+          <w:tcPr>
+            <w:tcW w:type="dxa" w:w="1881"/>
+          </w:tcPr>
+          <w:p>
+            <w:r>
+              <w:rPr>
+                <w:sz w:val="17"/>
+              </w:rPr>
+              <w:t>Documentos y autenticidad</w:t>
+            </w:r>
+          </w:p>
+        </w:tc>
+        <w:tc>
+          <w:tcPr>
+            <w:tcW w:type="dxa" w:w="1881"/>
+          </w:tcPr>
+          <w:p>
+            <w:r>
+              <w:rPr>
+                <w:sz w:val="17"/>
+              </w:rPr>
+              <w:t>Ley 527 de 1999, art. 11 (CNDJ 2021-00235-02)</w:t>
+            </w:r>
+          </w:p>
+        </w:tc>
+        <w:tc>
+          <w:tcPr>
+            <w:tcW w:type="dxa" w:w="1881"/>
+          </w:tcPr>
+          <w:p>
+            <w:r>
+              <w:rPr>
+                <w:sz w:val="17"/>
+              </w:rPr>
+              <w:t>191</w:t>
+            </w:r>
+          </w:p>
+        </w:tc>
+        <w:tc>
+          <w:tcPr>
+            <w:tcW w:type="dxa" w:w="1881"/>
+          </w:tcPr>
+          <w:p>
+            <w:r>
+              <w:rPr>
+                <w:sz w:val="17"/>
+              </w:rPr>
+              <w:t>ARTÍCULO 191. PRESUNCIÓN DE AUTENTICIDAD. Los documentos allegados al proceso se presumen auténticos, así como los informes rendidos por las entidades públicas o privadas requeridas por la autoridad disciplinaria. En caso de duda deberán ser sometidos a examen técnico, para lo cual se atenderá lo señalado en lo referido a la prueba perici</w:t>
+            </w:r>
+          </w:p>
+        </w:tc>
+        <w:tc>
+          <w:tcPr>
+            <w:tcW w:type="dxa" w:w="1881"/>
+          </w:tcPr>
+          <w:p>
+            <w:r>
+              <w:rPr>
+                <w:sz w:val="17"/>
+              </w:rPr>
+              <w:t>En caso de duda, examen técnico (prueba pericial): coincide con el reproche de la CNDJ por no acudir a pruebas técnicas para identificar al emisor del mensaje de voz.</w:t>
+            </w:r>
+          </w:p>
+        </w:tc>
+      </w:tr>
+    </w:tbl>
+    <w:p>
+      <w:r>
+        <w:t>Las observaciones son análisis de la asistente a partir de la comparación de textos; no son reglas de las sentencias. Para decidir el régimen aplicable en cada caso, determina la ley vigente al momento de los hechos y evalúa la favorabilidad (art. 8 de la Ley 1952).</w:t>
+      </w:r>
+    </w:p>
     <w:sectPr>
       <w:pgSz w:w="12240" w:h="15840"/>
       <w:pgMar w:top="1440" w:right="1417" w:bottom="1440" w:left="1417" w:header="720" w:footer="720" w:gutter="0"/>

</xml_diff>